<commit_message>
doc: Entrega do incremento III e correção dos apontamentos
</commit_message>
<xml_diff>
--- a/docs/FAI_SI_PID_TRAMPO_2026.v1.0.docx
+++ b/docs/FAI_SI_PID_TRAMPO_2026.v1.0.docx
@@ -992,6 +992,71 @@
           </w:p>
         </w:tc>
       </w:tr>
+      <w:tr>
+        <w:tc>
+          <w:tcPr>
+            <w:tcW w:w="1413" w:type="dxa"/>
+          </w:tcPr>
+          <w:p>
+            <w:pPr>
+              <w:spacing w:before="40" w:after="40" w:line="360" w:lineRule="auto"/>
+              <w:jc w:val="both"/>
+            </w:pPr>
+            <w:r>
+              <w:t>15/05/2026</w:t>
+            </w:r>
+          </w:p>
+        </w:tc>
+        <w:tc>
+          <w:tcPr>
+            <w:tcW w:w="993" w:type="dxa"/>
+          </w:tcPr>
+          <w:p>
+            <w:pPr>
+              <w:spacing w:before="40" w:after="40" w:line="360" w:lineRule="auto"/>
+            </w:pPr>
+            <w:r>
+              <w:t>3.0</w:t>
+            </w:r>
+          </w:p>
+        </w:tc>
+        <w:tc>
+          <w:tcPr>
+            <w:tcW w:w="3402" w:type="dxa"/>
+          </w:tcPr>
+          <w:p>
+            <w:pPr>
+              <w:spacing w:before="40" w:after="40" w:line="360" w:lineRule="auto"/>
+              <w:rPr>
+                <w:smallCaps/>
+              </w:rPr>
+            </w:pPr>
+            <w:r>
+              <w:rPr>
+                <w:smallCaps/>
+              </w:rPr>
+              <w:t>Ryan Henrique Aguiar</w:t>
+            </w:r>
+          </w:p>
+        </w:tc>
+        <w:tc>
+          <w:tcPr>
+            <w:tcW w:w="3118" w:type="dxa"/>
+          </w:tcPr>
+          <w:p>
+            <w:pPr>
+              <w:spacing w:before="40" w:after="40" w:line="360" w:lineRule="auto"/>
+              <w:jc w:val="both"/>
+            </w:pPr>
+            <w:r>
+              <w:t>Correção dos apontamentos e entrega do</w:t>
+            </w:r>
+            <w:r>
+              <w:t xml:space="preserve"> Incremento III</w:t>
+            </w:r>
+          </w:p>
+        </w:tc>
+      </w:tr>
     </w:tbl>
     <w:p>
       <w:pPr>
@@ -999,6 +1064,7 @@
         <w:rPr>
           <w:b/>
           <w:bCs/>
+          <w:u w:val="single"/>
         </w:rPr>
       </w:pPr>
     </w:p>
@@ -1109,6 +1175,12 @@
     <w:bookmarkEnd w:id="1" w:displacedByCustomXml="next"/>
     <w:sdt>
       <w:sdtPr>
+        <w:rPr>
+          <w:rFonts w:ascii="Times New Roman" w:eastAsia="Times New Roman" w:hAnsi="Times New Roman" w:cs="Times New Roman"/>
+          <w:color w:val="auto"/>
+          <w:sz w:val="24"/>
+          <w:szCs w:val="24"/>
+        </w:rPr>
         <w:id w:val="1832245433"/>
         <w:docPartObj>
           <w:docPartGallery w:val="Table of Contents"/>
@@ -1117,12 +1189,8 @@
       </w:sdtPr>
       <w:sdtEndPr>
         <w:rPr>
-          <w:rFonts w:ascii="Times New Roman" w:eastAsia="Times New Roman" w:hAnsi="Times New Roman" w:cs="Times New Roman"/>
           <w:b/>
           <w:bCs/>
-          <w:color w:val="auto"/>
-          <w:sz w:val="24"/>
-          <w:szCs w:val="24"/>
         </w:rPr>
       </w:sdtEndPr>
       <w:sdtContent>
@@ -4130,34 +4198,56 @@
       </w:r>
     </w:p>
     <w:p>
-      <w:r>
+      <w:pPr>
+        <w:rPr>
+          <w:lang w:val="en-US"/>
+        </w:rPr>
+      </w:pPr>
+      <w:r>
+        <w:rPr>
+          <w:lang w:val="en-US"/>
+        </w:rPr>
         <w:t xml:space="preserve">RS </w:t>
       </w:r>
       <w:proofErr w:type="gramStart"/>
       <w:r>
+        <w:rPr>
+          <w:lang w:val="en-US"/>
+        </w:rPr>
         <w:t>3  -</w:t>
       </w:r>
       <w:proofErr w:type="gramEnd"/>
       <w:r>
-        <w:t xml:space="preserve"> Sistema operacional Microsoft Windows 1</w:t>
-      </w:r>
-      <w:r>
-        <w:t>1</w:t>
-      </w:r>
-      <w:r>
-        <w:t xml:space="preserve"> Professional.</w:t>
-      </w:r>
-    </w:p>
-    <w:p>
-      <w:pPr>
         <w:rPr>
           <w:lang w:val="en-US"/>
         </w:rPr>
-      </w:pPr>
+        <w:t xml:space="preserve"> Sistema </w:t>
+      </w:r>
+      <w:proofErr w:type="spellStart"/>
       <w:r>
         <w:rPr>
           <w:lang w:val="en-US"/>
         </w:rPr>
+        <w:t>operacional</w:t>
+      </w:r>
+      <w:proofErr w:type="spellEnd"/>
+      <w:r>
+        <w:rPr>
+          <w:lang w:val="en-US"/>
+        </w:rPr>
+        <w:t xml:space="preserve"> Microsoft Windows 11 Professional.</w:t>
+      </w:r>
+    </w:p>
+    <w:p>
+      <w:pPr>
+        <w:rPr>
+          <w:lang w:val="en-US"/>
+        </w:rPr>
+      </w:pPr>
+      <w:r>
+        <w:rPr>
+          <w:lang w:val="en-US"/>
+        </w:rPr>
         <w:t xml:space="preserve">RS </w:t>
       </w:r>
       <w:proofErr w:type="gramStart"/>
@@ -4263,42 +4353,87 @@
       </w:r>
     </w:p>
     <w:p>
-      <w:r>
+      <w:pPr>
+        <w:rPr>
+          <w:lang w:val="en-US"/>
+        </w:rPr>
+      </w:pPr>
+      <w:r>
+        <w:rPr>
+          <w:lang w:val="en-US"/>
+        </w:rPr>
         <w:t xml:space="preserve">RS </w:t>
       </w:r>
       <w:proofErr w:type="gramStart"/>
       <w:r>
+        <w:rPr>
+          <w:lang w:val="en-US"/>
+        </w:rPr>
         <w:t>8  -</w:t>
       </w:r>
       <w:proofErr w:type="gramEnd"/>
       <w:r>
+        <w:rPr>
+          <w:lang w:val="en-US"/>
+        </w:rPr>
         <w:t xml:space="preserve"> </w:t>
       </w:r>
       <w:proofErr w:type="spellStart"/>
       <w:r>
+        <w:rPr>
+          <w:lang w:val="en-US"/>
+        </w:rPr>
         <w:t>Github</w:t>
       </w:r>
       <w:proofErr w:type="spellEnd"/>
     </w:p>
     <w:p>
-      <w:r>
+      <w:pPr>
+        <w:rPr>
+          <w:lang w:val="en-US"/>
+        </w:rPr>
+      </w:pPr>
+      <w:r>
+        <w:rPr>
+          <w:lang w:val="en-US"/>
+        </w:rPr>
         <w:t xml:space="preserve">RS 9 – </w:t>
       </w:r>
       <w:proofErr w:type="spellStart"/>
       <w:r>
+        <w:rPr>
+          <w:lang w:val="en-US"/>
+        </w:rPr>
         <w:t>VSCode</w:t>
       </w:r>
       <w:proofErr w:type="spellEnd"/>
       <w:r>
+        <w:rPr>
+          <w:lang w:val="en-US"/>
+        </w:rPr>
         <w:t xml:space="preserve"> 1.113.0</w:t>
       </w:r>
     </w:p>
     <w:p>
-      <w:r>
+      <w:pPr>
+        <w:rPr>
+          <w:lang w:val="en-US"/>
+        </w:rPr>
+      </w:pPr>
+      <w:r>
+        <w:rPr>
+          <w:lang w:val="en-US"/>
+        </w:rPr>
         <w:t>RS 10 – Node.js 22.22.1</w:t>
       </w:r>
     </w:p>
-    <w:p/>
+    <w:p>
+      <w:pPr>
+        <w:rPr>
+          <w:lang w:val="en-US"/>
+        </w:rPr>
+      </w:pPr>
+    </w:p>
     <w:p>
       <w:pPr>
         <w:pStyle w:val="Ttulo2"/>
@@ -6474,6 +6609,7 @@
   <w:style w:type="character" w:default="1" w:styleId="Fontepargpadro">
     <w:name w:val="Default Paragraph Font"/>
     <w:uiPriority w:val="1"/>
+    <w:semiHidden/>
     <w:unhideWhenUsed/>
   </w:style>
   <w:style w:type="table" w:default="1" w:styleId="Tabelanormal">

</xml_diff>